<commit_message>
Update 20대 여성 트렌드 report via 작성가 subagent
Regenerated by the 작성가 subagent (now registered) instead of the
main agent doing it directly; adds an overview section.

Co-Authored-By: Claude Sonnet 5 <noreply@anthropic.com>
Claude-Session: https://claude.ai/code/session_01RGX9bj2fJied7TVQridoFr
</commit_message>
<xml_diff>
--- a/output/research/2026년_20대여성_트렌드_보고서.docx
+++ b/output/research/2026년_20대여성_트렌드_보고서.docx
@@ -10,7 +10,7 @@
         <w:rPr>
           <w:rFonts w:ascii="맑은 고딕" w:hAnsi="맑은 고딕" w:eastAsia="맑은 고딕"/>
           <w:b/>
-          <w:color w:val="B5325B"/>
+          <w:color w:val="B03A5B"/>
           <w:sz w:val="80"/>
         </w:rPr>
         <w:t>2026년 20대 여성 트렌드 리서치 보고서</w:t>
@@ -35,10 +35,10 @@
         <w:rPr>
           <w:rFonts w:ascii="맑은 고딕" w:hAnsi="맑은 고딕" w:eastAsia="맑은 고딕"/>
           <w:b/>
-          <w:color w:val="B5325B"/>
+          <w:color w:val="B03A5B"/>
           <w:sz w:val="52"/>
         </w:rPr>
-        <w:t>1. 패션 / 뷰티</w:t>
+        <w:t>1. 개요</w:t>
       </w:r>
     </w:p>
     <w:p>
@@ -47,25 +47,18 @@
           <w:rFonts w:ascii="맑은 고딕" w:hAnsi="맑은 고딕" w:eastAsia="맑은 고딕"/>
           <w:sz w:val="40"/>
         </w:rPr>
-        <w:t>2026 S/S 시즌은 미니멀리즘 대신 "과감함"이 화두다. 여러 겹 레이어링으로 브라를 드러내거나 존재감 있는 주얼리를 매치하는 스타일링이 유행하며, 실크·레이스 소재의 '부두아 스타일'과 강한 색채 대비의 스트라이프 패턴이 부각되고 있다. '조용한 럭셔리(quiet luxury)'가 저물고 생동감 있는 자기표현 스타일로 이동 중이다.</w:t>
+        <w:t>본 보고서는 2026년 20대 여성을 중심으로 한 패션·뷰티, 소비 경향, 콘텐츠/SNS, 여가·취미, 가치관·라이프스타일 5개 영역의 최신 트렌드를 조사관 에이전트의 리서치 결과를 바탕으로 정리한 것이다. 각 영역별 핵심 흐름과 수치적 근거를 함께 제시하며, 마지막 장에는 참고한 출처 목록을 수록했다.</w:t>
       </w:r>
     </w:p>
     <w:p>
       <w:r>
         <w:rPr>
           <w:rFonts w:ascii="맑은 고딕" w:hAnsi="맑은 고딕" w:eastAsia="맑은 고딕"/>
-          <w:sz w:val="40"/>
+          <w:b/>
+          <w:color w:val="B03A5B"/>
+          <w:sz w:val="52"/>
         </w:rPr>
-        <w:t>뷰티 분야에서는 글레이즈드 도넛 질감의 밀착 팩, 초승달 모양 아이패치 등이 인기 아이템으로 꼽히며, AI·AR 기반 맞춤형 뷰티 서비스가 부상하고 있다.</w:t>
-      </w:r>
-    </w:p>
-    <w:p>
-      <w:r>
-        <w:rPr>
-          <w:rFonts w:ascii="맑은 고딕" w:hAnsi="맑은 고딕" w:eastAsia="맑은 고딕"/>
-          <w:sz w:val="40"/>
-        </w:rPr>
-        <w:t>가성비 뷰티도 뚜렷한 흐름이다. 다이소 화장품이 한국콜마·코스맥스 등 대형 제조사 OEM으로 올리브영·백화점 제품과 유사한 성분을 5,000원대에 판매하며 인기를 끌고, '리들샷'(니들 형태 흡수 강화 세럼)이 다이소·올리브영에서 품귀 현상을 보이는 등 PDRN·콜라겐·레티놀 같은 고기능 성분이 저가 라인까지 확산되고 있다.</w:t>
+        <w:t>2. 패션/뷰티</w:t>
       </w:r>
     </w:p>
     <w:p>
@@ -77,7 +70,7 @@
           <w:rFonts w:ascii="맑은 고딕" w:hAnsi="맑은 고딕" w:eastAsia="맑은 고딕"/>
           <w:sz w:val="40"/>
         </w:rPr>
-        <w:t>로우라이즈: 2023년부터 판매 급증, 2026년 전년 대비 173% 증가 추정 — 과거의 부담스러운 '새깅룩'보다 골반에 자연스럽게 걸치는 순화된 형태로 재해석</w:t>
+        <w:t>2026 S/S 시즌은 미니멀리즘 대신 "과감함"이 화두. 여러 겹 레이어링으로 브라를 드러내거나 존재감 있는 주얼리를 매치하는 스타일링이 유행하며, 실크·레이스 소재의 '부두아 스타일'과 강한 색채 대비의 스트라이프 패턴이 부각됨.</w:t>
       </w:r>
     </w:p>
     <w:p>
@@ -89,45 +82,7 @@
           <w:rFonts w:ascii="맑은 고딕" w:hAnsi="맑은 고딕" w:eastAsia="맑은 고딕"/>
           <w:sz w:val="40"/>
         </w:rPr>
-        <w:t>발레코어: 나이키×스킴스 협업 등 메리제인 슈즈, 새틴 소재를 접목한 무드가 화제</w:t>
-      </w:r>
-    </w:p>
-    <w:p>
-      <w:r>
-        <w:rPr>
-          <w:rFonts w:ascii="맑은 고딕" w:hAnsi="맑은 고딕" w:eastAsia="맑은 고딕"/>
-          <w:b/>
-          <w:color w:val="B5325B"/>
-          <w:sz w:val="52"/>
-        </w:rPr>
-        <w:t>2. 소비 경향</w:t>
-      </w:r>
-    </w:p>
-    <w:p>
-      <w:r>
-        <w:rPr>
-          <w:rFonts w:ascii="맑은 고딕" w:hAnsi="맑은 고딕" w:eastAsia="맑은 고딕"/>
-          <w:sz w:val="40"/>
-        </w:rPr>
-        <w:t>20대 여성 월평균 지출은 약 89.4만 원으로 20대 남성(77.6만 원)보다 10만 원 이상 높다. "작년보다 지출이 늘었다"는 응답이 43.3%로 전체 평균(32.9%)을 크게 상회하며, 세대 중 소비 증가세가 가장 뚜렷하다.</w:t>
-      </w:r>
-    </w:p>
-    <w:p>
-      <w:r>
-        <w:rPr>
-          <w:rFonts w:ascii="맑은 고딕" w:hAnsi="맑은 고딕" w:eastAsia="맑은 고딕"/>
-          <w:sz w:val="40"/>
-        </w:rPr>
-        <w:t>구매 채널을 보면 편의점 식음료 구매 비중이 34.1%(전체 평균 21.5%), 다이소 등 생활용품샵 식음료 구매가 14.2%(전체 평균 8.5%)로, Z세대 여성 특유의 '근거리·소량 구매' 패턴이 나타난다.</w:t>
-      </w:r>
-    </w:p>
-    <w:p>
-      <w:r>
-        <w:rPr>
-          <w:rFonts w:ascii="맑은 고딕" w:hAnsi="맑은 고딕" w:eastAsia="맑은 고딕"/>
-          <w:sz w:val="40"/>
-        </w:rPr>
-        <w:t>소비 가치관은 저렴한 가격 중시(76.0%)와 취향·덕질 투자(74.3%)가 공존하는 "합리성+자기만족" 이중 구조를 보인다. 안전성·안정성 중시(70.7%→76.3%)는 오르는 반면 디자인 우선도(73.1%→66.8%)는 하락해, 실속·품질 중심으로 이동하고 있다.</w:t>
+        <w:t>"조용한 럭셔리(quiet luxury)" 트렌드가 저물고, 생동감 있는 자기표현 스타일로 무게중심이 이동 중.</w:t>
       </w:r>
     </w:p>
     <w:p>
@@ -139,7 +94,7 @@
           <w:rFonts w:ascii="맑은 고딕" w:hAnsi="맑은 고딕" w:eastAsia="맑은 고딕"/>
           <w:sz w:val="40"/>
         </w:rPr>
-        <w:t>2026 소비 키워드 '제철코어': 지금 아니면 놓치는 계절 한정 소비 — 에이블리 계절 과일 모티프 의류 거래액 전년 대비 200%↑</w:t>
+        <w:t>로우라이즈: 2023년부터 판매가 급증했고 2026년에는 전년 대비 173% 증가한 것으로 추정. 과거 부담스러운 '새깅룩'보다 골반에 자연스럽게 걸치는 순화된 형태로 재해석됨.</w:t>
       </w:r>
     </w:p>
     <w:p>
@@ -151,7 +106,7 @@
           <w:rFonts w:ascii="맑은 고딕" w:hAnsi="맑은 고딕" w:eastAsia="맑은 고딕"/>
           <w:sz w:val="40"/>
         </w:rPr>
-        <w:t>2026 소비 키워드 '나노 커뮤니티': 취향 단위로 극세분화된 소규모 커뮤니티 소비</w:t>
+        <w:t>발레코어: 나이키×스킴스 협업 등 메리제인 슈즈, 새틴 소재를 접목한 '발레코어' 무드가 화제.</w:t>
       </w:r>
     </w:p>
     <w:p>
@@ -163,7 +118,19 @@
           <w:rFonts w:ascii="맑은 고딕" w:hAnsi="맑은 고딕" w:eastAsia="맑은 고딕"/>
           <w:sz w:val="40"/>
         </w:rPr>
-        <w:t>팬덤/굿즈: K-POP 굿즈 시장 약 21억 달러(2025년 추산), 팬덤 경제 규모 약 8조 원(2023년 기준, 매년 두 자릿수 성장) — QR·NFC 카드가 든 친환경 앨범, 버추얼 아이돌 AR 포토카드·디지털 멤버십 카드 등 IT 접목 굿즈가 새 표준으로 부상</w:t>
+        <w:t>뷰티 아이템: 글레이즈드 도넛 질감의 밀착 팩, 초승달 모양 아이패치 등이 인기. AI·AR 기반 맞춤형 뷰티 서비스가 부상.</w:t>
+      </w:r>
+    </w:p>
+    <w:p>
+      <w:pPr>
+        <w:pStyle w:val="ListBullet"/>
+      </w:pPr>
+      <w:r>
+        <w:rPr>
+          <w:rFonts w:ascii="맑은 고딕" w:hAnsi="맑은 고딕" w:eastAsia="맑은 고딕"/>
+          <w:sz w:val="40"/>
+        </w:rPr>
+        <w:t>가성비 뷰티: 다이소 화장품이 한국콜마·코스맥스 등 대형 제조사 OEM으로 생산되어 올리브영·백화점 제품과 유사한 성분을 5,000원대에 판매. '리들샷'(니들 형태 흡수 강화 세럼)이 다이소·올리브영에서 품귀 현상을 빚음. PDRN·콜라겐·레티놀 등 고기능 성분이 저가 라인까지 확산.</w:t>
       </w:r>
     </w:p>
     <w:p>
@@ -171,10 +138,10 @@
         <w:rPr>
           <w:rFonts w:ascii="맑은 고딕" w:hAnsi="맑은 고딕" w:eastAsia="맑은 고딕"/>
           <w:b/>
-          <w:color w:val="B5325B"/>
+          <w:color w:val="B03A5B"/>
           <w:sz w:val="52"/>
         </w:rPr>
-        <w:t>3. 콘텐츠 / SNS</w:t>
+        <w:t>3. 소비 경향</w:t>
       </w:r>
     </w:p>
     <w:p>
@@ -183,7 +150,7 @@
           <w:rFonts w:ascii="맑은 고딕" w:hAnsi="맑은 고딕" w:eastAsia="맑은 고딕"/>
           <w:sz w:val="40"/>
         </w:rPr>
-        <w:t>인스타그램 릴스·틱톡 등 숏폼 콘텐츠가 전략의 핵심으로 자리잡았으며, 플랫폼 체류 시간의 50% 이상이 영상 콘텐츠에 집중되어 있다.</w:t>
+        <w:t>20대 여성의 월평균 지출은 약 89.4만 원으로, 20대 남성(77.6만 원)보다 10만 원 이상 높다. "작년보다 지출이 늘었다"는 응답은 43.3%로 전체 평균(32.9%)을 크게 웃돌아, 세대 중 소비 증가세가 가장 뚜렷하게 나타났다.</w:t>
       </w:r>
     </w:p>
     <w:p>
@@ -192,7 +159,7 @@
           <w:rFonts w:ascii="맑은 고딕" w:hAnsi="맑은 고딕" w:eastAsia="맑은 고딕"/>
           <w:sz w:val="40"/>
         </w:rPr>
-        <w:t>팔로워 2천~2만5천 명 규모의 마이크로 인플루언서가 ROI 면에서 더 높은 성과를 내면서, 메가 인플루언서(노출·확산)와 마이크로 인플루언서(실제 전환)의 투트랙 마케팅이 보편화되고 있다.</w:t>
+        <w:t>구매 채널 측면에서는 편의점에서의 식음료 구매 비중이 34.1%(전체 평균 21.5%), 다이소 등 생활용품샵에서의 식음료 구매가 14.2%(전체 평균 8.5%)로, 근거리·소량 구매 패턴이 두드러진다.</w:t>
       </w:r>
     </w:p>
     <w:p>
@@ -201,18 +168,7 @@
           <w:rFonts w:ascii="맑은 고딕" w:hAnsi="맑은 고딕" w:eastAsia="맑은 고딕"/>
           <w:sz w:val="40"/>
         </w:rPr>
-        <w:t>인플루언서 콘텐츠는 SNS 게시물에 그치지 않고 웹사이트·랜딩페이지·뉴스레터·오프라인 디스플레이까지 확장되어 '브랜드 자산'으로 재활용되는 흐름이 뚜렷하다.</w:t>
-      </w:r>
-    </w:p>
-    <w:p>
-      <w:r>
-        <w:rPr>
-          <w:rFonts w:ascii="맑은 고딕" w:hAnsi="맑은 고딕" w:eastAsia="맑은 고딕"/>
-          <w:b/>
-          <w:color w:val="B5325B"/>
-          <w:sz w:val="52"/>
-        </w:rPr>
-        <w:t>4. 여가 / 취미</w:t>
+        <w:t>소비 가치관은 저렴한 가격을 중시하는 태도(76.0%)와 취향·덕질에 대한 투자(74.3%)가 공존하는 "합리성+자기만족"의 이중 구조로 요약된다. 안전성·안정성 중시 응답은 70.7%에서 76.3%로 상승한 반면, 디자인 우선도는 73.1%에서 66.8%로 하락해 실속·품질 중심으로 이동하는 경향이 확인된다.</w:t>
       </w:r>
     </w:p>
     <w:p>
@@ -221,7 +177,7 @@
           <w:rFonts w:ascii="맑은 고딕" w:hAnsi="맑은 고딕" w:eastAsia="맑은 고딕"/>
           <w:sz w:val="40"/>
         </w:rPr>
-        <w:t>'오운완'식 인증보다 '즐기는' 운동으로 무게중심이 이동하고 있다. 이색 풍경을 찾는 '여행 러닝'이 뜨고, 패셔너블한 운동복이 대중화되었다.</w:t>
+        <w:t>2026년 소비 키워드로는 계절 한정 소비를 뜻하는 '제철코어'(에이블리의 계절 과일 모티프 의류 거래액이 전년 대비 200% 증가)와, 취향 단위로 극세분화된 소규모 커뮤니티를 뜻하는 '나노 커뮤니티'가 꼽힌다.</w:t>
       </w:r>
     </w:p>
     <w:p>
@@ -230,7 +186,112 @@
           <w:rFonts w:ascii="맑은 고딕" w:hAnsi="맑은 고딕" w:eastAsia="맑은 고딕"/>
           <w:sz w:val="40"/>
         </w:rPr>
-        <w:t>그룹 필라테스, 발레, 수영 등 경험·관계 중심의 소그룹·프라이빗 운동이 인기를 끌며, '오래 지속 가능한 운동'에 대한 선호가 늘고 있다.</w:t>
+        <w:t>팬덤·굿즈 시장도 주목할 만하다. K-POP 굿즈 시장은 2025년 기준 약 21억 달러로 추산되며, 팬덤 경제 규모는 2023년 기준 약 8조 원으로 매년 두 자릿수 성장세를 보이고 있다. QR·NFC 카드가 내장된 친환경 앨범, 버추얼 아이돌의 AR 포토카드·디지털 멤버십 카드 등 IT를 접목한 굿즈가 새로운 표준으로 부상하고 있다.</w:t>
+      </w:r>
+    </w:p>
+    <w:p>
+      <w:r>
+        <w:rPr>
+          <w:rFonts w:ascii="맑은 고딕" w:hAnsi="맑은 고딕" w:eastAsia="맑은 고딕"/>
+          <w:b/>
+          <w:color w:val="B03A5B"/>
+          <w:sz w:val="52"/>
+        </w:rPr>
+        <w:t>4. 콘텐츠/SNS</w:t>
+      </w:r>
+    </w:p>
+    <w:p>
+      <w:pPr>
+        <w:pStyle w:val="ListBullet"/>
+      </w:pPr>
+      <w:r>
+        <w:rPr>
+          <w:rFonts w:ascii="맑은 고딕" w:hAnsi="맑은 고딕" w:eastAsia="맑은 고딕"/>
+          <w:sz w:val="40"/>
+        </w:rPr>
+        <w:t>숏폼 우위: 인스타그램 릴스·틱톡 등 숏폼이 콘텐츠 전략의 핵심으로 자리잡았으며, 플랫폼 체류 시간의 50% 이상이 영상 콘텐츠에 집중되고 있음.</w:t>
+      </w:r>
+    </w:p>
+    <w:p>
+      <w:pPr>
+        <w:pStyle w:val="ListBullet"/>
+      </w:pPr>
+      <w:r>
+        <w:rPr>
+          <w:rFonts w:ascii="맑은 고딕" w:hAnsi="맑은 고딕" w:eastAsia="맑은 고딕"/>
+          <w:sz w:val="40"/>
+        </w:rPr>
+        <w:t>마이크로 인플루언서 부상: 팔로워 2천~2만5천 명 규모의 크리에이터가 ROI 면에서 더 높은 성과를 보임. 메가 인플루언서(노출·확산)와 마이크로 인플루언서(실제 전환)를 병행하는 투트랙 마케팅이 보편화됨.</w:t>
+      </w:r>
+    </w:p>
+    <w:p>
+      <w:pPr>
+        <w:pStyle w:val="ListBullet"/>
+      </w:pPr>
+      <w:r>
+        <w:rPr>
+          <w:rFonts w:ascii="맑은 고딕" w:hAnsi="맑은 고딕" w:eastAsia="맑은 고딕"/>
+          <w:sz w:val="40"/>
+        </w:rPr>
+        <w:t>콘텐츠 확장: 인플루언서 콘텐츠가 SNS 게시물에 그치지 않고 웹사이트·랜딩페이지·뉴스레터·오프라인 디스플레이까지 '브랜드 자산'으로 재활용되는 흐름이 강화됨.</w:t>
+      </w:r>
+    </w:p>
+    <w:p>
+      <w:r>
+        <w:rPr>
+          <w:rFonts w:ascii="맑은 고딕" w:hAnsi="맑은 고딕" w:eastAsia="맑은 고딕"/>
+          <w:b/>
+          <w:color w:val="B03A5B"/>
+          <w:sz w:val="52"/>
+        </w:rPr>
+        <w:t>5. 여가/취미</w:t>
+      </w:r>
+    </w:p>
+    <w:p>
+      <w:pPr>
+        <w:pStyle w:val="ListBullet"/>
+      </w:pPr>
+      <w:r>
+        <w:rPr>
+          <w:rFonts w:ascii="맑은 고딕" w:hAnsi="맑은 고딕" w:eastAsia="맑은 고딕"/>
+          <w:sz w:val="40"/>
+        </w:rPr>
+        <w:t>감성 지향 운동: '오운완'식 인증보다 '즐기는' 운동으로 무게중심이 이동. 이색 풍경을 찾는 '여행 러닝', 패셔너블한 운동복이 대중화됨.</w:t>
+      </w:r>
+    </w:p>
+    <w:p>
+      <w:pPr>
+        <w:pStyle w:val="ListBullet"/>
+      </w:pPr>
+      <w:r>
+        <w:rPr>
+          <w:rFonts w:ascii="맑은 고딕" w:hAnsi="맑은 고딕" w:eastAsia="맑은 고딕"/>
+          <w:sz w:val="40"/>
+        </w:rPr>
+        <w:t>소그룹·프라이빗 운동: 그룹 필라테스, 발레, 수영 등 경험·관계 중심의 소규모 운동이 인기를 끌며, '오래 지속 가능한 운동'에 대한 선호가 증가.</w:t>
+      </w:r>
+    </w:p>
+    <w:p>
+      <w:pPr>
+        <w:pStyle w:val="ListBullet"/>
+      </w:pPr>
+      <w:r>
+        <w:rPr>
+          <w:rFonts w:ascii="맑은 고딕" w:hAnsi="맑은 고딕" w:eastAsia="맑은 고딕"/>
+          <w:sz w:val="40"/>
+        </w:rPr>
+        <w:t>정적 취미 확대: 명상, 뜨개질 등 수양적 성격의 취미가 부상하고 있으며, 피부관리·면역력 강화 제품에 대한 관심도 함께 상승.</w:t>
+      </w:r>
+    </w:p>
+    <w:p>
+      <w:r>
+        <w:rPr>
+          <w:rFonts w:ascii="맑은 고딕" w:hAnsi="맑은 고딕" w:eastAsia="맑은 고딕"/>
+          <w:b/>
+          <w:color w:val="B03A5B"/>
+          <w:sz w:val="52"/>
+        </w:rPr>
+        <w:t>6. 가치관/라이프스타일</w:t>
       </w:r>
     </w:p>
     <w:p>
@@ -239,18 +300,7 @@
           <w:rFonts w:ascii="맑은 고딕" w:hAnsi="맑은 고딕" w:eastAsia="맑은 고딕"/>
           <w:sz w:val="40"/>
         </w:rPr>
-        <w:t>명상, 뜨개질 등 수양적 성격의 정적 취미도 함께 부상하고 있으며, 피부관리·면역력 강화 제품에 대한 관심도 동반 상승하고 있다.</w:t>
-      </w:r>
-    </w:p>
-    <w:p>
-      <w:r>
-        <w:rPr>
-          <w:rFonts w:ascii="맑은 고딕" w:hAnsi="맑은 고딕" w:eastAsia="맑은 고딕"/>
-          <w:b/>
-          <w:color w:val="B5325B"/>
-          <w:sz w:val="52"/>
-        </w:rPr>
-        <w:t>5. 가치관 / 라이프스타일</w:t>
+        <w:t>결혼·연애관은 조사 기관과 질문 방식에 따라 결과가 다소 엇갈리는 양상을 보인다.</w:t>
       </w:r>
     </w:p>
     <w:p>
@@ -259,7 +309,7 @@
           <w:rFonts w:ascii="맑은 고딕" w:hAnsi="맑은 고딕" w:eastAsia="맑은 고딕"/>
           <w:sz w:val="40"/>
         </w:rPr>
-        <w:t>결혼·연애관은 조사 기관과 질문 방식에 따라 결과가 엇갈려 교차 확인이 필요하다. 저출산고령사회위원회 조사(2025년 3월, 25~49세 2,650명 대상)에서는 25~29세 여성의 "결혼 의향"이 56.6%(2024.3)에서 64.0%(2025.3)로 7.4%p 상승했고, "자녀 필요성" 동의도 48.7%로 1년 전 대비 14.3%p 증가했다.</w:t>
+        <w:t>저출산고령사회위원회 조사(2025년 3월, 25~49세 2,650명 대상)에 따르면 25~29세 여성의 "결혼 의향"은 2024년 3월 56.6%에서 2025년 3월 64.0%로 7.4%p 상승했고, "자녀 필요성"에 동의하는 비율도 48.7%로 1년 전 대비 14.3%p 증가했다.</w:t>
       </w:r>
     </w:p>
     <w:p>
@@ -268,7 +318,7 @@
           <w:rFonts w:ascii="맑은 고딕" w:hAnsi="맑은 고딕" w:eastAsia="맑은 고딕"/>
           <w:sz w:val="40"/>
         </w:rPr>
-        <w:t>반면 HR코퍼레이션 2026 결혼인식조사(2026년 3월)에서는 18~29세 여성 중 "결혼한다면 자녀를 가져야 한다"에 동의한 비율이 12%에 불과해 동일 연령 남성(53%)과 41%p 격차를 보였고, "사랑하는 사람이 있다면 결혼해야 한다"에는 60%가 비동의했다.</w:t>
+        <w:t>반면 HR코퍼레이션의 2026 결혼인식조사(2026년 3월)에서는 18~29세 여성 중 "결혼한다면 자녀를 가져야 한다"에 동의한 비율이 12%에 불과해 동일 연령 남성(53%)과 41%p의 격차를 보였다. "사랑하는 사람이 있으면 결혼해야 한다"는 진술에는 60%가 비동의했다.</w:t>
       </w:r>
     </w:p>
     <w:p>
@@ -277,7 +327,7 @@
           <w:rFonts w:ascii="맑은 고딕" w:hAnsi="맑은 고딕" w:eastAsia="맑은 고딕"/>
           <w:sz w:val="40"/>
         </w:rPr>
-        <w:t>두 조사를 종합하면, 결혼에 대한 개인적 의향은 최근 다소 회복세를 보이지만, "결혼이 필수·규범"이라거나 "결혼=출산"이라는 인식은 20대 여성에서 여전히 약한 것으로 해석된다.</w:t>
+        <w:t>두 조사를 종합하면, 결혼에 대한 개인적 의향은 최근 다소 회복세를 보이는 반면, "결혼이 필수·규범"이라거나 "결혼은 곧 출산으로 이어져야 한다"는 인식은 20대 여성 사이에서 여전히 약한 것으로 해석된다.</w:t>
       </w:r>
     </w:p>
     <w:p>
@@ -286,7 +336,7 @@
           <w:rFonts w:ascii="맑은 고딕" w:hAnsi="맑은 고딕" w:eastAsia="맑은 고딕"/>
           <w:sz w:val="40"/>
         </w:rPr>
-        <w:t>역할분담 인식에서는 18~29세 여성의 71~82%가 생계부양·생활비관리·집안일을 "부부가 함께 책임져야 한다"고 응답해, 성별 역할 구분 자체를 받아들이지 않는 경향이 전 연령대 중 가장 강하게 나타났다.</w:t>
+        <w:t>역할분담 인식에서는 18~29세 여성의 71~82%가 생계부양·생활비관리·집안일을 "부부가 함께 책임져야 한다"고 응답해, 성별 역할 구분을 받아들이지 않는 경향이 전 연령대 중 가장 강하게 나타났다.</w:t>
       </w:r>
     </w:p>
     <w:p>
@@ -295,7 +345,16 @@
           <w:rFonts w:ascii="맑은 고딕" w:hAnsi="맑은 고딕" w:eastAsia="맑은 고딕"/>
           <w:sz w:val="40"/>
         </w:rPr>
-        <w:t>20대 초·중반부터 연애 단계에서 결혼정보회사를 찾는 사례가 늘고 있으며, 소비 측면에서도 환경친화적 제품 선호, 소유보다 공유(공동구매·렌탈)를 지향하는 경향이 함께 관찰된다.</w:t>
+        <w:t>결혼정보회사 이용 연령도 낮아지는 추세로, 20대 초·중반부터 연애 단계에서 결혼정보회사를 찾는 사례가 늘고 있다.</w:t>
+      </w:r>
+    </w:p>
+    <w:p>
+      <w:r>
+        <w:rPr>
+          <w:rFonts w:ascii="맑은 고딕" w:hAnsi="맑은 고딕" w:eastAsia="맑은 고딕"/>
+          <w:sz w:val="40"/>
+        </w:rPr>
+        <w:t>소비 측면에서도 이러한 가치관이 연결되어, 환경친화적 제품에 대한 선호와 소유보다 공유(공동구매·렌탈)를 지향하는 경향이 함께 관찰된다.</w:t>
       </w:r>
     </w:p>
     <w:p>
@@ -303,10 +362,10 @@
         <w:rPr>
           <w:rFonts w:ascii="맑은 고딕" w:hAnsi="맑은 고딕" w:eastAsia="맑은 고딕"/>
           <w:b/>
-          <w:color w:val="B5325B"/>
+          <w:color w:val="B03A5B"/>
           <w:sz w:val="52"/>
         </w:rPr>
-        <w:t>6. 출처</w:t>
+        <w:t>7. 출처</w:t>
       </w:r>
     </w:p>
     <w:p>

</xml_diff>